<commit_message>
Docs: update TODO, README and serial command list
Co-Authored-By: Claude Opus 5.5 <noreply@anthropic.com>
</commit_message>
<xml_diff>
--- a/Documentation/Commandes série disponibles.docx
+++ b/Documentation/Commandes série disponibles.docx
@@ -129,7 +129,7 @@
         <w:rPr>
           <w:lang w:val="fr-FR"/>
         </w:rPr>
-        <w:t>w0 / w1 : vis sans fin OFF / ON</w:t>
+        <w:t>w0 / w1 : vis sans fin OFF / ON (coupée au bout de 3 s)</w:t>
       </w:r>
     </w:p>
     <w:p>
@@ -167,7 +167,7 @@
       </w:r>
       <w:proofErr w:type="spellEnd"/>
       <w:r>
-        <w:t xml:space="preserve"> OFF / ON</w:t>
+        <w:t xml:space="preserve"> OFF / ON (coupée au bout de 10 min)</w:t>
       </w:r>
     </w:p>
     <w:p>
@@ -232,7 +232,7 @@
       </w:r>
       <w:proofErr w:type="spellStart"/>
       <w:r>
-        <w:t>basique</w:t>
+        <w:t>basique ; pendant un COOLDOWN : reprise en RUN sans couper la pompe (refusé si ALARM ou MODE OFF)</w:t>
       </w:r>
       <w:proofErr w:type="spellEnd"/>
     </w:p>
@@ -355,7 +355,7 @@
       </w:r>
       <w:proofErr w:type="spellEnd"/>
       <w:r>
-        <w:t xml:space="preserve"> + auto)</w:t>
+        <w:t xml:space="preserve"> + auto) : cooldown 10 min puis IDLE ; en AUTO, pas de redémarrage avant la fin de la plage en cours</w:t>
       </w:r>
     </w:p>
     <w:p>
@@ -374,7 +374,7 @@
       </w:r>
       <w:proofErr w:type="spellEnd"/>
       <w:r>
-        <w:t xml:space="preserve"> + auto)</w:t>
+        <w:t xml:space="preserve"> + auto) : relâche le blocage de l’AUTO (le cooldown en cours continue)</w:t>
       </w:r>
     </w:p>
     <w:p>
@@ -668,7 +668,7 @@
         <w:rPr>
           <w:lang w:val="fr-FR"/>
         </w:rPr>
-        <w:t>PON &lt;ms&gt; : durée ON pellets (50..5000, et &lt; PP)</w:t>
+        <w:t>PON &lt;ms&gt; : durée ON pellets (50..5000, et PON ≤ PP − 500)</w:t>
       </w:r>
     </w:p>
     <w:p>

</xml_diff>